<commit_message>
Update README, enhance LLM routing, and refine build workflows
- Revised README to clarify AI edit visibility and paragraph change classifications.
- Added new function to LLM routing for handling Gemini model IDs.
- Updated desktop-build.yml to include additional dependencies and streamline packaging steps for Linux and Windows.
- Introduced new database function for impact version chunk deletion in store_db.py.
- Enhanced version storage to include a new snapshot reason for review edits.
</commit_message>
<xml_diff>
--- a/iterthink/templates/Iterthink Standard.docx
+++ b/iterthink/templates/Iterthink Standard.docx
@@ -456,137 +456,6 @@
         <w:tab/>
         <w:tab/>
         <w:t xml:space="preserve">{Date}</w:t>
-      </w:r>
-    </w:p>
-    <w:p>
-      <w:pPr>
-        <w:rPr/>
-      </w:pPr>
-      <w:r>
-        <w:br w:type="page"/>
-      </w:r>
-      <w:r>
-        <w:rPr>
-          <w:rtl w:val="0"/>
-        </w:rPr>
-      </w:r>
-    </w:p>
-    <w:p>
-      <w:pPr>
-        <w:pStyle w:val="Heading1"/>
-        <w:rPr/>
-      </w:pPr>
-      <w:bookmarkStart w:colFirst="0" w:colLast="0" w:name="_bthrawkqjkmt" w:id="2"/>
-      <w:bookmarkEnd w:id="2"/>
-      <w:r>
-        <w:rPr>
-          <w:rtl w:val="0"/>
-        </w:rPr>
-        <w:t xml:space="preserve">Heading 1</w:t>
-      </w:r>
-    </w:p>
-    <w:p>
-      <w:pPr>
-        <w:pStyle w:val="Heading2"/>
-        <w:rPr/>
-      </w:pPr>
-      <w:bookmarkStart w:colFirst="0" w:colLast="0" w:name="_galbj3cyiyry" w:id="3"/>
-      <w:bookmarkEnd w:id="3"/>
-      <w:r>
-        <w:rPr>
-          <w:rtl w:val="0"/>
-        </w:rPr>
-        <w:t xml:space="preserve">Heading 2</w:t>
-      </w:r>
-    </w:p>
-    <w:p>
-      <w:pPr>
-        <w:pStyle w:val="Heading3"/>
-        <w:rPr>
-          <w:i w:val="0"/>
-          <w:iCs w:val="0"/>
-        </w:rPr>
-      </w:pPr>
-      <w:bookmarkStart w:colFirst="0" w:colLast="0" w:name="_tlf2zb4xb3qt" w:id="4"/>
-      <w:bookmarkEnd w:id="4"/>
-      <w:r>
-        <w:rPr>
-          <w:i w:val="0"/>
-          <w:iCs w:val="0"/>
-          <w:rtl w:val="0"/>
-        </w:rPr>
-        <w:t xml:space="preserve">Heading 3</w:t>
-      </w:r>
-    </w:p>
-    <w:p>
-      <w:pPr>
-        <w:rPr/>
-      </w:pPr>
-      <w:r>
-        <w:rPr>
-          <w:rtl w:val="0"/>
-        </w:rPr>
-      </w:r>
-    </w:p>
-    <w:p>
-      <w:pPr>
-        <w:rPr/>
-      </w:pPr>
-      <w:r>
-        <w:rPr>
-          <w:rtl w:val="0"/>
-        </w:rPr>
-        <w:t xml:space="preserve">Text</w:t>
-      </w:r>
-    </w:p>
-    <w:p>
-      <w:pPr>
-        <w:rPr/>
-      </w:pPr>
-      <w:r>
-        <w:rPr>
-          <w:rtl w:val="0"/>
-        </w:rPr>
-      </w:r>
-    </w:p>
-    <w:p>
-      <w:pPr>
-        <w:rPr/>
-      </w:pPr>
-      <w:r>
-        <w:rPr>
-          <w:rtl w:val="0"/>
-        </w:rPr>
-      </w:r>
-    </w:p>
-    <w:p>
-      <w:pPr>
-        <w:rPr/>
-      </w:pPr>
-      <w:r>
-        <w:rPr>
-          <w:rtl w:val="0"/>
-        </w:rPr>
-      </w:r>
-    </w:p>
-    <w:p>
-      <w:pPr>
-        <w:rPr/>
-      </w:pPr>
-      <w:r>
-        <w:rPr>
-          <w:rtl w:val="0"/>
-        </w:rPr>
-      </w:r>
-    </w:p>
-    <w:p>
-      <w:pPr>
-        <w:rPr/>
-      </w:pPr>
-      <w:r>
-        <w:rPr>
-          <w:rtl w:val="0"/>
-        </w:rPr>
       </w:r>
     </w:p>
     <w:sectPr>
@@ -612,7 +481,107 @@
       <w:rPr>
         <w:rtl w:val="0"/>
       </w:rPr>
-      <w:t xml:space="preserve">{Titel}</w:t>
+    </w:r>
+  </w:p>
+  <w:tbl>
+    <w:tblPr>
+      <w:tblStyle w:val="Table1"/>
+      <w:tblW w:w="9720.0" w:type="dxa"/>
+      <w:jc w:val="left"/>
+      <w:tblLayout w:type="fixed"/>
+      <w:tblLook w:val="0600"/>
+    </w:tblPr>
+    <w:tblGrid>
+      <w:gridCol w:w="8355"/>
+      <w:gridCol w:w="1365"/>
+      <w:tblGridChange w:id="0">
+        <w:tblGrid>
+          <w:gridCol w:w="8355"/>
+          <w:gridCol w:w="1365"/>
+        </w:tblGrid>
+      </w:tblGridChange>
+    </w:tblGrid>
+    <w:tr>
+      <w:trPr>
+        <w:cantSplit w:val="0"/>
+        <w:tblHeader w:val="0"/>
+      </w:trPr>
+      <w:tc>
+        <w:tcPr>
+          <w:shd w:fill="auto" w:val="clear"/>
+          <w:tcMar>
+            <w:top w:w="100.0" w:type="dxa"/>
+            <w:left w:w="100.0" w:type="dxa"/>
+            <w:bottom w:w="100.0" w:type="dxa"/>
+            <w:right w:w="100.0" w:type="dxa"/>
+          </w:tcMar>
+          <w:vAlign w:val="top"/>
+        </w:tcPr>
+        <w:p>
+          <w:pPr>
+            <w:rPr/>
+          </w:pPr>
+          <w:r>
+            <w:rPr>
+              <w:rtl w:val="0"/>
+            </w:rPr>
+            <w:t xml:space="preserve">{Titel}</w:t>
+          </w:r>
+        </w:p>
+      </w:tc>
+      <w:tc>
+        <w:tcPr>
+          <w:shd w:fill="auto" w:val="clear"/>
+          <w:tcMar>
+            <w:top w:w="100.0" w:type="dxa"/>
+            <w:left w:w="100.0" w:type="dxa"/>
+            <w:bottom w:w="100.0" w:type="dxa"/>
+            <w:right w:w="100.0" w:type="dxa"/>
+          </w:tcMar>
+          <w:vAlign w:val="top"/>
+        </w:tcPr>
+        <w:p>
+          <w:pPr>
+            <w:jc w:val="right"/>
+            <w:rPr/>
+          </w:pPr>
+          <w:r>
+            <w:rPr/>
+            <w:fldChar w:fldCharType="begin"/>
+            <w:instrText xml:space="preserve">PAGE</w:instrText>
+            <w:fldChar w:fldCharType="separate"/>
+            <w:fldChar w:fldCharType="end"/>
+          </w:r>
+          <w:r>
+            <w:rPr>
+              <w:rtl w:val="0"/>
+            </w:rPr>
+            <w:t xml:space="preserve">/</w:t>
+          </w:r>
+          <w:r>
+            <w:rPr/>
+            <w:fldChar w:fldCharType="begin"/>
+            <w:instrText xml:space="preserve">NUMPAGES</w:instrText>
+            <w:fldChar w:fldCharType="separate"/>
+            <w:fldChar w:fldCharType="end"/>
+          </w:r>
+          <w:r>
+            <w:rPr>
+              <w:rtl w:val="0"/>
+            </w:rPr>
+          </w:r>
+        </w:p>
+      </w:tc>
+    </w:tr>
+  </w:tbl>
+  <w:p>
+    <w:pPr>
+      <w:rPr/>
+    </w:pPr>
+    <w:r>
+      <w:rPr>
+        <w:rtl w:val="0"/>
+      </w:rPr>
       <w:tab/>
       <w:tab/>
       <w:tab/>
@@ -624,33 +593,6 @@
       <w:tab/>
       <w:tab/>
       <w:tab/>
-      <w:tab/>
-      <w:tab/>
-    </w:r>
-    <w:r>
-      <w:rPr/>
-      <w:fldChar w:fldCharType="begin"/>
-      <w:instrText xml:space="preserve">PAGE</w:instrText>
-      <w:fldChar w:fldCharType="separate"/>
-      <w:fldChar w:fldCharType="end"/>
-    </w:r>
-    <w:r>
-      <w:rPr>
-        <w:rtl w:val="0"/>
-      </w:rPr>
-      <w:t xml:space="preserve">/</w:t>
-    </w:r>
-    <w:r>
-      <w:rPr/>
-      <w:fldChar w:fldCharType="begin"/>
-      <w:instrText xml:space="preserve">NUMPAGES</w:instrText>
-      <w:fldChar w:fldCharType="separate"/>
-      <w:fldChar w:fldCharType="end"/>
-    </w:r>
-    <w:r>
-      <w:rPr>
-        <w:rtl w:val="0"/>
-      </w:rPr>
     </w:r>
   </w:p>
 </w:ftr>
@@ -854,6 +796,50 @@
       <w:sz w:val="30"/>
       <w:szCs w:val="30"/>
     </w:rPr>
+  </w:style>
+  <w:style w:type="table" w:styleId="Table1">
+    <w:basedOn w:val="TableNormal"/>
+    <w:tblPr>
+      <w:tblStyleRowBandSize w:val="1"/>
+      <w:tblStyleColBandSize w:val="1"/>
+      <w:tblCellMar/>
+    </w:tblPr>
+    <w:tblStylePr w:type="band1Horz">
+      <w:tcPr/>
+    </w:tblStylePr>
+    <w:tblStylePr w:type="band1Vert">
+      <w:tcPr/>
+    </w:tblStylePr>
+    <w:tblStylePr w:type="band2Horz">
+      <w:tcPr/>
+    </w:tblStylePr>
+    <w:tblStylePr w:type="band2Vert">
+      <w:tcPr/>
+    </w:tblStylePr>
+    <w:tblStylePr w:type="firstCol">
+      <w:tcPr/>
+    </w:tblStylePr>
+    <w:tblStylePr w:type="firstRow">
+      <w:tcPr/>
+    </w:tblStylePr>
+    <w:tblStylePr w:type="lastCol">
+      <w:tcPr/>
+    </w:tblStylePr>
+    <w:tblStylePr w:type="lastRow">
+      <w:tcPr/>
+    </w:tblStylePr>
+    <w:tblStylePr w:type="neCell">
+      <w:tcPr/>
+    </w:tblStylePr>
+    <w:tblStylePr w:type="nwCell">
+      <w:tcPr/>
+    </w:tblStylePr>
+    <w:tblStylePr w:type="seCell">
+      <w:tcPr/>
+    </w:tblStylePr>
+    <w:tblStylePr w:type="swCell">
+      <w:tcPr/>
+    </w:tblStylePr>
   </w:style>
 </w:styles>
 </file>

</xml_diff>